<commit_message>
feat: close M0-M3 with the two-port adventure prototype
Keep the original sailing simulator at the repository root and add an independent game at adventure/index.html. Implement wood trading, supplies, delivery, tier-2 upgrades, save/resume, and JSON portability.

Update the Markdown and Word specification, record milestone completion and asset provenance, and add 14 game-rule tests. Verify the first voyage, persistence, responsive controls, offline play, and recovery without WebGL.
</commit_message>
<xml_diff>
--- a/docs/pirate-voyage_game-spec_v1.docx
+++ b/docs/pirate-voyage_game-spec_v1.docx
@@ -40,7 +40,7 @@
         <w:rPr>
           <w:sz w:val="20"/>
         </w:rPr>
-        <w:t>作成日：2026年9月30日　版：1.0</w:t>
+        <w:t>作成日：2026年9月30日　版：1.1</w:t>
       </w:r>
     </w:p>
     <w:p>
@@ -914,7 +914,7 @@
                 <w:color w:val="000000"/>
                 <w:sz w:val="20"/>
               </w:rPr>
-              <w:t>引き続き index.html 一ファイルで実行可能にする</w:t>
+              <w:t>自由航海版とゲーム版を同じリポジトリに置き、各版を独立したHTML一ファイルで実行可能にする</w:t>
             </w:r>
           </w:p>
         </w:tc>
@@ -1920,12 +1920,413 @@
     </w:p>
     <w:p>
       <w:r>
-        <w:t>既存の「自由航海」はタイトル画面から引き続き選べるようにする。冒険モードでは所持金や物語を保存し、自由航海では天候や位置を自由に変更できる。両モードの状態と保存領域を分け、自由航海での操作が冒険の進行に入り込まないようにする。</w:t>
+        <w:t>既存の「自由航海」はリポジトリ直下の index.html で引き続き公開する。ゲーム版は adventure/index.html とし、既存版のコピーを出発点にして開発する。ゲーム版では所持金や物語を保存し、自由航海では従来どおり天候や位置を自由に変更できる。両版の状態と保存領域を分け、自由航海での操作がゲームの進行に入り込まないようにする。</w:t>
       </w:r>
     </w:p>
     <w:p>
       <w:r>
         <w:t>現行の三本マスト船は上位船として活かす。序盤の小型船は同じ Builder による独自の船体と一〜二本マストの形状を追加し、見た目と能力の成長を一致させる。単に三本マスト船の能力だけを小型船扱いにする状態は、最初の試作までに限定する。</w:t>
+      </w:r>
+    </w:p>
+    <w:p>
+      <w:pPr>
+        <w:pStyle w:val="Heading2"/>
+      </w:pPr>
+      <w:r>
+        <w:t>2 1 同じリポジトリで二つの版を公開する構成</w:t>
+      </w:r>
+    </w:p>
+    <w:p>
+      <w:r>
+        <w:t>リポジトリは ryotamatsuki/pirate-voyage を継続して使用する。既存版の index.html は保持し、ゲーム版の追加と更新は adventure フォルダーで行う。各版のHTMLにCSSとJavaScriptを内包し、二つのファイルを別々にダウンロードして実行できるようにする。既存版から共通スクリプトを読み込む構成は採用せず、ゲーム版の変更が既存版の実行に影響しないようにする。</w:t>
+      </w:r>
+    </w:p>
+    <w:tbl>
+      <w:tblPr>
+        <w:tblW w:type="auto" w:w="0"/>
+        <w:jc w:val="center"/>
+        <w:tblLayout w:type="fixed"/>
+        <w:tblLook w:firstColumn="1" w:firstRow="1" w:lastColumn="0" w:lastRow="0" w:noHBand="0" w:noVBand="1" w:val="04A0"/>
+        <w:tblBorders>
+          <w:top w:val="single" w:sz="4" w:color="D9D9D9"/>
+          <w:left w:val="single" w:sz="4" w:color="D9D9D9"/>
+          <w:bottom w:val="single" w:sz="4" w:color="D9D9D9"/>
+          <w:right w:val="single" w:sz="4" w:color="D9D9D9"/>
+          <w:insideH w:val="single" w:sz="4" w:color="D9D9D9"/>
+          <w:insideV w:val="single" w:sz="4" w:color="D9D9D9"/>
+        </w:tblBorders>
+      </w:tblPr>
+      <w:tblGrid>
+        <w:gridCol w:w="1872"/>
+        <w:gridCol w:w="3168"/>
+        <w:gridCol w:w="4752"/>
+      </w:tblGrid>
+      <w:tr>
+        <w:trPr>
+          <w:cantSplit/>
+          <w:tblHeader w:val="true"/>
+        </w:trPr>
+        <w:tc>
+          <w:tcPr>
+            <w:tcW w:type="dxa" w:w="1872"/>
+            <w:vAlign w:val="center"/>
+            <w:tcMar>
+              <w:top w:w="65" w:type="dxa"/>
+              <w:bottom w:w="65" w:type="dxa"/>
+              <w:left w:w="85" w:type="dxa"/>
+              <w:right w:w="85" w:type="dxa"/>
+            </w:tcMar>
+            <w:shd w:fill="DDEBF0"/>
+          </w:tcPr>
+          <w:p>
+            <w:pPr>
+              <w:keepNext/>
+              <w:spacing w:line="282" w:lineRule="exact" w:before="0" w:after="0"/>
+              <w:jc w:val="center"/>
+            </w:pPr>
+            <w:r>
+              <w:rPr>
+                <w:b/>
+                <w:color w:val="000000"/>
+                <w:sz w:val="20"/>
+              </w:rPr>
+              <w:t>保存場所</w:t>
+            </w:r>
+          </w:p>
+        </w:tc>
+        <w:tc>
+          <w:tcPr>
+            <w:tcW w:type="dxa" w:w="3168"/>
+            <w:vAlign w:val="center"/>
+            <w:tcMar>
+              <w:top w:w="65" w:type="dxa"/>
+              <w:bottom w:w="65" w:type="dxa"/>
+              <w:left w:w="85" w:type="dxa"/>
+              <w:right w:w="85" w:type="dxa"/>
+            </w:tcMar>
+            <w:shd w:fill="DDEBF0"/>
+          </w:tcPr>
+          <w:p>
+            <w:pPr>
+              <w:keepNext/>
+              <w:spacing w:line="282" w:lineRule="exact" w:before="0" w:after="0"/>
+              <w:jc w:val="center"/>
+            </w:pPr>
+            <w:r>
+              <w:rPr>
+                <w:b/>
+                <w:color w:val="000000"/>
+                <w:sz w:val="20"/>
+              </w:rPr>
+              <w:t>用途</w:t>
+            </w:r>
+          </w:p>
+        </w:tc>
+        <w:tc>
+          <w:tcPr>
+            <w:tcW w:type="dxa" w:w="4752"/>
+            <w:vAlign w:val="center"/>
+            <w:tcMar>
+              <w:top w:w="65" w:type="dxa"/>
+              <w:bottom w:w="65" w:type="dxa"/>
+              <w:left w:w="85" w:type="dxa"/>
+              <w:right w:w="85" w:type="dxa"/>
+            </w:tcMar>
+            <w:shd w:fill="DDEBF0"/>
+          </w:tcPr>
+          <w:p>
+            <w:pPr>
+              <w:keepNext/>
+              <w:spacing w:line="282" w:lineRule="exact" w:before="0" w:after="0"/>
+              <w:jc w:val="center"/>
+            </w:pPr>
+            <w:r>
+              <w:rPr>
+                <w:b/>
+                <w:color w:val="000000"/>
+                <w:sz w:val="20"/>
+              </w:rPr>
+              <w:t>GitHub Pagesの公開パス</w:t>
+            </w:r>
+          </w:p>
+        </w:tc>
+      </w:tr>
+      <w:tr>
+        <w:trPr>
+          <w:cantSplit/>
+        </w:trPr>
+        <w:tc>
+          <w:tcPr>
+            <w:tcW w:type="dxa" w:w="1872"/>
+            <w:vAlign w:val="center"/>
+            <w:tcMar>
+              <w:top w:w="65" w:type="dxa"/>
+              <w:bottom w:w="65" w:type="dxa"/>
+              <w:left w:w="85" w:type="dxa"/>
+              <w:right w:w="85" w:type="dxa"/>
+            </w:tcMar>
+            <w:shd w:fill="FFFFFF"/>
+          </w:tcPr>
+          <w:p>
+            <w:pPr>
+              <w:keepNext w:val="0"/>
+              <w:spacing w:line="282" w:lineRule="exact" w:before="0" w:after="0"/>
+              <w:jc w:val="left"/>
+            </w:pPr>
+            <w:r>
+              <w:rPr>
+                <w:b w:val="0"/>
+                <w:color w:val="000000"/>
+                <w:sz w:val="20"/>
+              </w:rPr>
+              <w:t>index.html</w:t>
+            </w:r>
+          </w:p>
+        </w:tc>
+        <w:tc>
+          <w:tcPr>
+            <w:tcW w:type="dxa" w:w="3168"/>
+            <w:vAlign w:val="center"/>
+            <w:tcMar>
+              <w:top w:w="65" w:type="dxa"/>
+              <w:bottom w:w="65" w:type="dxa"/>
+              <w:left w:w="85" w:type="dxa"/>
+              <w:right w:w="85" w:type="dxa"/>
+            </w:tcMar>
+            <w:shd w:fill="FFFFFF"/>
+          </w:tcPr>
+          <w:p>
+            <w:pPr>
+              <w:keepNext w:val="0"/>
+              <w:spacing w:line="282" w:lineRule="exact" w:before="0" w:after="0"/>
+              <w:jc w:val="left"/>
+            </w:pPr>
+            <w:r>
+              <w:rPr>
+                <w:b w:val="0"/>
+                <w:color w:val="000000"/>
+                <w:sz w:val="20"/>
+              </w:rPr>
+              <w:t>現在のシンプルな自由航海版</w:t>
+            </w:r>
+          </w:p>
+        </w:tc>
+        <w:tc>
+          <w:tcPr>
+            <w:tcW w:type="dxa" w:w="4752"/>
+            <w:vAlign w:val="center"/>
+            <w:tcMar>
+              <w:top w:w="65" w:type="dxa"/>
+              <w:bottom w:w="65" w:type="dxa"/>
+              <w:left w:w="85" w:type="dxa"/>
+              <w:right w:w="85" w:type="dxa"/>
+            </w:tcMar>
+            <w:shd w:fill="FFFFFF"/>
+          </w:tcPr>
+          <w:p>
+            <w:pPr>
+              <w:keepNext w:val="0"/>
+              <w:spacing w:line="282" w:lineRule="exact" w:before="0" w:after="0"/>
+              <w:jc w:val="left"/>
+            </w:pPr>
+            <w:r>
+              <w:rPr>
+                <w:b w:val="0"/>
+                <w:color w:val="000000"/>
+                <w:sz w:val="20"/>
+              </w:rPr>
+              <w:t>/pirate-voyage/</w:t>
+            </w:r>
+          </w:p>
+        </w:tc>
+      </w:tr>
+      <w:tr>
+        <w:trPr>
+          <w:cantSplit/>
+        </w:trPr>
+        <w:tc>
+          <w:tcPr>
+            <w:tcW w:type="dxa" w:w="1872"/>
+            <w:vAlign w:val="center"/>
+            <w:tcMar>
+              <w:top w:w="65" w:type="dxa"/>
+              <w:bottom w:w="65" w:type="dxa"/>
+              <w:left w:w="85" w:type="dxa"/>
+              <w:right w:w="85" w:type="dxa"/>
+            </w:tcMar>
+            <w:shd w:fill="F7FAFB"/>
+          </w:tcPr>
+          <w:p>
+            <w:pPr>
+              <w:keepNext w:val="0"/>
+              <w:spacing w:line="282" w:lineRule="exact" w:before="0" w:after="0"/>
+              <w:jc w:val="left"/>
+            </w:pPr>
+            <w:r>
+              <w:rPr>
+                <w:b w:val="0"/>
+                <w:color w:val="000000"/>
+                <w:sz w:val="20"/>
+              </w:rPr>
+              <w:t>adventure/index.html</w:t>
+            </w:r>
+          </w:p>
+        </w:tc>
+        <w:tc>
+          <w:tcPr>
+            <w:tcW w:type="dxa" w:w="3168"/>
+            <w:vAlign w:val="center"/>
+            <w:tcMar>
+              <w:top w:w="65" w:type="dxa"/>
+              <w:bottom w:w="65" w:type="dxa"/>
+              <w:left w:w="85" w:type="dxa"/>
+              <w:right w:w="85" w:type="dxa"/>
+            </w:tcMar>
+            <w:shd w:fill="F7FAFB"/>
+          </w:tcPr>
+          <w:p>
+            <w:pPr>
+              <w:keepNext w:val="0"/>
+              <w:spacing w:line="282" w:lineRule="exact" w:before="0" w:after="0"/>
+              <w:jc w:val="left"/>
+            </w:pPr>
+            <w:r>
+              <w:rPr>
+                <w:b w:val="0"/>
+                <w:color w:val="000000"/>
+                <w:sz w:val="20"/>
+              </w:rPr>
+              <w:t>交易と探索を加えるゲーム版</w:t>
+            </w:r>
+          </w:p>
+        </w:tc>
+        <w:tc>
+          <w:tcPr>
+            <w:tcW w:type="dxa" w:w="4752"/>
+            <w:vAlign w:val="center"/>
+            <w:tcMar>
+              <w:top w:w="65" w:type="dxa"/>
+              <w:bottom w:w="65" w:type="dxa"/>
+              <w:left w:w="85" w:type="dxa"/>
+              <w:right w:w="85" w:type="dxa"/>
+            </w:tcMar>
+            <w:shd w:fill="F7FAFB"/>
+          </w:tcPr>
+          <w:p>
+            <w:pPr>
+              <w:keepNext w:val="0"/>
+              <w:spacing w:line="282" w:lineRule="exact" w:before="0" w:after="0"/>
+              <w:jc w:val="left"/>
+            </w:pPr>
+            <w:r>
+              <w:rPr>
+                <w:b w:val="0"/>
+                <w:color w:val="000000"/>
+                <w:sz w:val="20"/>
+              </w:rPr>
+              <w:t>/pirate-voyage/adventure/</w:t>
+            </w:r>
+          </w:p>
+        </w:tc>
+      </w:tr>
+      <w:tr>
+        <w:trPr>
+          <w:cantSplit/>
+        </w:trPr>
+        <w:tc>
+          <w:tcPr>
+            <w:tcW w:type="dxa" w:w="1872"/>
+            <w:vAlign w:val="center"/>
+            <w:tcMar>
+              <w:top w:w="65" w:type="dxa"/>
+              <w:bottom w:w="65" w:type="dxa"/>
+              <w:left w:w="85" w:type="dxa"/>
+              <w:right w:w="85" w:type="dxa"/>
+            </w:tcMar>
+            <w:shd w:fill="FFFFFF"/>
+          </w:tcPr>
+          <w:p>
+            <w:pPr>
+              <w:keepNext w:val="0"/>
+              <w:spacing w:line="282" w:lineRule="exact" w:before="0" w:after="0"/>
+              <w:jc w:val="left"/>
+            </w:pPr>
+            <w:r>
+              <w:rPr>
+                <w:b w:val="0"/>
+                <w:color w:val="000000"/>
+                <w:sz w:val="20"/>
+              </w:rPr>
+              <w:t>docs/</w:t>
+            </w:r>
+          </w:p>
+        </w:tc>
+        <w:tc>
+          <w:tcPr>
+            <w:tcW w:type="dxa" w:w="3168"/>
+            <w:vAlign w:val="center"/>
+            <w:tcMar>
+              <w:top w:w="65" w:type="dxa"/>
+              <w:bottom w:w="65" w:type="dxa"/>
+              <w:left w:w="85" w:type="dxa"/>
+              <w:right w:w="85" w:type="dxa"/>
+            </w:tcMar>
+            <w:shd w:fill="FFFFFF"/>
+          </w:tcPr>
+          <w:p>
+            <w:pPr>
+              <w:keepNext w:val="0"/>
+              <w:spacing w:line="282" w:lineRule="exact" w:before="0" w:after="0"/>
+              <w:jc w:val="left"/>
+            </w:pPr>
+            <w:r>
+              <w:rPr>
+                <w:b w:val="0"/>
+                <w:color w:val="000000"/>
+                <w:sz w:val="20"/>
+              </w:rPr>
+              <w:t>企画書、仕様書、開発記録</w:t>
+            </w:r>
+          </w:p>
+        </w:tc>
+        <w:tc>
+          <w:tcPr>
+            <w:tcW w:type="dxa" w:w="4752"/>
+            <w:vAlign w:val="center"/>
+            <w:tcMar>
+              <w:top w:w="65" w:type="dxa"/>
+              <w:bottom w:w="65" w:type="dxa"/>
+              <w:left w:w="85" w:type="dxa"/>
+              <w:right w:w="85" w:type="dxa"/>
+            </w:tcMar>
+            <w:shd w:fill="FFFFFF"/>
+          </w:tcPr>
+          <w:p>
+            <w:pPr>
+              <w:keepNext w:val="0"/>
+              <w:spacing w:line="282" w:lineRule="exact" w:before="0" w:after="0"/>
+              <w:jc w:val="left"/>
+            </w:pPr>
+            <w:r>
+              <w:rPr>
+                <w:b w:val="0"/>
+                <w:color w:val="000000"/>
+                <w:sz w:val="20"/>
+              </w:rPr>
+              <w:t>文書の参照先</w:t>
+            </w:r>
+          </w:p>
+        </w:tc>
+      </w:tr>
+    </w:tbl>
+    <w:p>
+      <w:pPr>
+        <w:spacing w:after="40" w:line="40" w:lineRule="exact"/>
+      </w:pPr>
+    </w:p>
+    <w:p>
+      <w:r>
+        <w:t>ゲーム版のタイトル画面とREADMEに自由航海版へのリンクを置く。GitHub Pagesでは main のリポジトリ直下を公開元とし、両版を同時に配信する。既存のChatGPT Sites版は自由航海版として維持し、ゲーム版のSites公開は別の公開作業で扱う。保存キーには pirate-voyage:adventure の名前空間と版を付け、他の版や作品のキーを削除しない。ゲーム版のリセットはゲーム版の保存だけを対象とし、破損した保存の読込み時には正常な保存を上書きしない。公開前に既存版のHTMLのGit blobを比較し、既存版の内容を変更していないことを確認する。</w:t>
       </w:r>
     </w:p>
     <w:p>
@@ -8033,7 +8434,7 @@
     </w:p>
     <w:p>
       <w:r>
-        <w:t>船体HPが35未満になると船速を20％下げ、入港時に修理を提案する。船体HPが0になったら遭難処理へ移り、描画だけを止めて進行を続ける状態を残さない。港の修理はHP一点につき1G、食料は一単位1Gを初期設定とする。通常の港メニュー操作はゲーム時間を止め、修理の確定時に0.25ゲーム日を進める。港内の食事と停泊は一日6Gで精算し、船内の食料を消費しない。</w:t>
+        <w:t>船体HPが35未満になると船速を20％下げ、入港時に修理を提案する。船体HPが0になったら遭難処理へ移り、描画だけを止めて進行を続ける状態を残さない。港の修理はHP一点につき1G、食料は一単位1Gを初期設定とする。通常の港メニュー操作はゲーム時間を止め、修理の確定時に0.25ゲーム日を進める。修理時の食事・停泊費は0.25日分の1.5Gを切り上げ、2Gとして修理代と一緒に精算する。港内の食事と停泊は一日6Gで精算し、船内の食料を消費しない。</w:t>
       </w:r>
     </w:p>
     <w:p>
@@ -14495,7 +14896,7 @@
     </w:p>
     <w:p>
       <w:r>
-        <w:t>配布物は index.html 一ファイルを維持する。内部は次の責務に分け、港画面のクリック処理から資源を直接書き換える構造を避ける。初期版ではビルドツールと新しい描画ライブラリを導入しない。</w:t>
+        <w:t>各版の配布物は、それぞれの index.html 一ファイルを維持する。ゲームの処理を追加する対象は adventure/index.html とし、リポジトリ直下の index.html は自由航海版として保持する。内部は次の責務に分け、港画面のクリック処理から資源を直接書き換える構造を避ける。初期版ではビルドツールと新しい描画ライブラリを導入しない。</w:t>
       </w:r>
     </w:p>
     <w:tbl>
@@ -15649,7 +16050,7 @@
     </w:p>
     <w:p>
       <w:r>
-        <w:t>最初に作るのは、灯待ち港と松帆港だけを往復し、木材を売買し、食料を補給して、段階2へ改造できる試作とする。物語の会話と多数の島を増やす前に、価格、時間、移動、補給、保存が一続きで動く状態を作る。この試作に触れて、航海中に次の目的が欲しくなるか、補給が作業になりすぎていないかを判断する。</w:t>
+        <w:t>最初に作るのは、灯待ち港と松帆港だけを往復し、木材を売買し、食料を補給して、段階2へ改造できる試作とする。物語の会話と多数の島を増やす前に、価格、時間、移動、補給、保存が一続きで動く状態を作る。この試作に触れて、航海中に次の目的が欲しくなるか、補給が作業になりすぎていないかを判断する。二港試作では、二港の位置を海図に示す。五港、未探索海図、第一章の完成はM4とM5で追加する。試作の実装済み範囲と検証結果は docs/development-status.md に記録する。</w:t>
       </w:r>
     </w:p>
     <w:p>
@@ -16584,7 +16985,7 @@
     </w:p>
     <w:p>
       <w:r>
-        <w:t>コードの変更を始める前に、現在の公開版へ戻せる基準点を残す。開発中の画面で確認してから GitHub Pages と Sites の公開版へ反映する。公開先ごとに保存移行と読込みを確認し、公開URLが同じでもセーブ形式の変更を見落とさない。</w:t>
+        <w:t>コードの変更を始める前に、現在の公開版へ戻せる基準点を残す。開発中の画面で確認してから GitHub Pages のゲーム版へ反映する。Sitesへのゲーム版の公開は、自由航海版を維持したまま別途行う。公開先ごとに保存移行と読込みを確認し、公開URLが同じでもセーブ形式の変更を見落とさない。</w:t>
       </w:r>
     </w:p>
     <w:p>
@@ -17861,7 +18262,7 @@
     </w:p>
     <w:p>
       <w:r>
-        <w:t>本書はゲームの企画と実装方針を定めるものであり、ゲーム本体の変更、コミット、公開は次の実装作業で行う。</w:t>
+        <w:t>本書はゲームの企画と実装方針を定める。開発の進捗と検証結果は docs/development-status.md に記録し、本書の完成版仕様と区別する。</w:t>
       </w:r>
     </w:p>
     <w:sectPr>

</xml_diff>

<commit_message>
docs: prioritize one-voyage prototype and record development stages
Record M4a before five ports, forecasts and ten encounters, and chapter one.
Add linked Issues, acceptance criteria, playtest template and development log.
Update Markdown and Word specification to revision 1.2; review all 24 pages.

Refs #1, #2, #3, #4, #5, #6, #7
</commit_message>
<xml_diff>
--- a/docs/pirate-voyage_game-spec_v1.docx
+++ b/docs/pirate-voyage_game-spec_v1.docx
@@ -40,7 +40,7 @@
         <w:rPr>
           <w:sz w:val="20"/>
         </w:rPr>
-        <w:t>作成日：2026年9月30日　版：1.1</w:t>
+        <w:t>作成日：2026年9月30日　版：1.2</w:t>
       </w:r>
     </w:p>
     <w:p>
@@ -49,6 +49,9 @@
       </w:pPr>
       <w:r>
         <w:t>既存の航海シミュレーションを、探索と交易を中心とする海洋冒険ゲームへ拡張するための企画、物語、実装仕様をまとめる。初期版は五港と第一章に絞り、船員、海賊行為、港への投資、五海域へ段階的に広げる。</w:t>
+      </w:r>
+      <w:r>
+        <w:t>次の工程では二港の一航海を先に改善し、五港、予報と十遭遇、第一章の順に開発する。</w:t>
       </w:r>
     </w:p>
     <w:p>
@@ -998,7 +1001,7 @@
     </w:p>
     <w:p>
       <w:r>
-        <w:t>2026年9月30日に GitHub の main を確認した。確認したコミットは 604a795f7fb9e9652e7f06a08262018155521280、index.html の blob は 6f891695f765f358ac79e062561c08006c4703da である。現在の画面上の名称は「黒潮の航海」で、外部ライブラリに依存しない WebGL の独自描画を使用している。[R7]</w:t>
+        <w:t>自由航海版の初期調査は、2026年9月30日に確認したコミット 604a795f7fb9e9652e7f06a08262018155521280 を基準とする。index.html の blob は 6f891695f765f358ac79e062561c08006c4703da である。画面上の名称は「黒潮の航海」で、外部ライブラリに依存しない WebGL の独自描画を使用している。下表は自由航海版からゲーム版へ接続する要素を示す。[R7]次の開発工程の基準は、ゲームv0.1.1のコミット 419152009b712658b7d4aaf1fa208d7e2a49e6fa とする。M0〜M3と初回ガイドは完了済みで、現在の実装と確認結果は開発進捗表を参照する。</w:t>
       </w:r>
     </w:p>
     <w:tbl>
@@ -5740,6 +5743,12 @@
       </w:r>
     </w:p>
     <w:p>
+      <w:pPr/>
+      <w:r>
+        <w:t>船の性能、海についての知識、利用できる航路をそれぞれ成長として扱う。M4aでは二港の航海中に観測浮標を発見し、寄り道、観測、報告、航路登録、帰路の移動短縮を一続きの体験にする。</w:t>
+      </w:r>
+    </w:p>
+    <w:p>
       <w:r>
         <w:t>初回は敵襲や嵐を強制せず、第一の入港と売却を保証する導入条件を設ける。船を改造した直後には、以前より遠い行き先の噂を出す。すべての強化を所持金だけで説明せず、補給能力と到達できる港の増加も表示する。</w:t>
       </w:r>
@@ -7430,6 +7439,12 @@
       </w:r>
     </w:p>
     <w:p>
+      <w:pPr/>
+      <w:r>
+        <w:t>初回案内で使う灯待ち港と松帆港の位置は、案内済みの既知情報として表示する。追加の港と観測地点は未知とし、二港の位置が既知でも未訪問の相場を確定情報として開示しない。旧記録で既に表示されている二港を、版移行で隠し直さない。</w:t>
+      </w:r>
+    </w:p>
+    <w:p>
       <w:r>
         <w:t>噂だけでは正確な港名や在庫を明かさない。港を見つけると位置、訪れると相場とサービス、調査すると航路の情報が分かる。海図の霧はUIで表現し、3Dの水平線に見える島を黒い幕で消す処理は行わない。</w:t>
       </w:r>
@@ -7450,6 +7465,12 @@
     <w:p>
       <w:r>
         <w:t>航海帳には発見、噂、売買記録、依頼、主筋、仲間の目的を記録する。追跡する目的は一つ選べるが、他の目的へいつでも切り替えられる。相場は最終確認日を示し、未訪問の港の正確な売値を保証しない。価格の履歴は直近十件までとし、セーブの容量を増やし続けない。</w:t>
+      </w:r>
+    </w:p>
+    <w:p>
+      <w:pPr/>
+      <w:r>
+        <w:t>観測の記録には、分かったこと、未確認のこと、次に試せることを対応付ける。視認、観測、報告、航路登録を別々の状態として保存し、記録の重複取得と二重報酬を防ぐ。未完成の次の地点を、実際に訪問できる目的地として案内しない。</w:t>
       </w:r>
     </w:p>
     <w:p>
@@ -8142,7 +8163,7 @@
                 <w:color w:val="000000"/>
                 <w:sz w:val="20"/>
               </w:rPr>
-              <w:t>発見済み</w:t>
+              <w:t>位置が既知</w:t>
             </w:r>
           </w:p>
         </w:tc>
@@ -8170,7 +8191,7 @@
                 <w:color w:val="000000"/>
                 <w:sz w:val="20"/>
               </w:rPr>
-              <w:t>灯待ち港と出港付近</w:t>
+              <w:t>案内済みの二港と出港付近</w:t>
             </w:r>
           </w:p>
         </w:tc>
@@ -15948,7 +15969,7 @@
         <w:keepNext w:val="0"/>
       </w:pPr>
       <w:r>
-        <w:t xml:space="preserve">  "discovery": {"ports": ["p_light"], "fogChunks": {}},</w:t>
+        <w:t xml:space="preserve">  "discovery": {"ports": ["p_light", "p_pine"], "fogChunks": {}},</w:t>
       </w:r>
     </w:p>
     <w:p>
@@ -16050,7 +16071,7 @@
     </w:p>
     <w:p>
       <w:r>
-        <w:t>最初に作るのは、灯待ち港と松帆港だけを往復し、木材を売買し、食料を補給して、段階2へ改造できる試作とする。物語の会話と多数の島を増やす前に、価格、時間、移動、補給、保存が一続きで動く状態を作る。この試作に触れて、航海中に次の目的が欲しくなるか、補給が作業になりすぎていないかを判断する。二港試作では、二港の位置を海図に示す。五港、未探索海図、第一章の完成はM4とM5で追加する。試作の実装済み範囲と検証結果は docs/development-status.md に記録する。</w:t>
+        <w:t>最初に作るのは、灯待ち港と松帆港だけを往復し、木材を売買し、食料を補給して、段階2へ改造できる試作とする。物語の会話と多数の島を増やす前に、価格、時間、移動、補給、保存が一続きで動く状態を作る。この試作に触れて、航海中に次の目的が欲しくなるか、補給が作業になりすぎていないかを判断する。二港試作では、二港の位置を海図に示す。M0からM3の二港試作と初回ガイドは、2026年9月30日にゲーム版v0.1.1として完了した。次はM4aとして二港の一航海を先に改善し、その後に五港、予報と十遭遇、第一章を追加する。試作の実装済み範囲と検証結果は docs/development-status.md に記録する。</w:t>
       </w:r>
     </w:p>
     <w:p>
@@ -16583,7 +16604,14 @@
                 <w:color w:val="000000"/>
                 <w:sz w:val="20"/>
               </w:rPr>
-              <w:t>五港と未探索海図</w:t>
+            </w:r>
+            <w:r>
+              <w:rPr>
+                <w:b w:val="0"/>
+                <w:color w:val="000000"/>
+                <w:sz w:val="20"/>
+              </w:rPr>
+              <w:t>一航海試作と五港探索</w:t>
             </w:r>
           </w:p>
         </w:tc>
@@ -16611,7 +16639,14 @@
                 <w:color w:val="000000"/>
                 <w:sz w:val="20"/>
               </w:rPr>
-              <w:t>発見と相場情報の範囲が一致する</w:t>
+            </w:r>
+            <w:r>
+              <w:rPr>
+                <w:b w:val="0"/>
+                <w:color w:val="000000"/>
+                <w:sz w:val="20"/>
+              </w:rPr>
+              <w:t>寄り道から次の目的が生まれ、発見と情報の範囲が一致する</w:t>
             </w:r>
           </w:p>
         </w:tc>
@@ -16999,6 +17034,627 @@
     <w:p>
       <w:r>
         <w:t>商品価格、距離、船、報酬、食料消費は内容データの定数へ集約する。仕様を変えたら変更理由、遊びへの影響、保存互換性を記録する。第一章の目標とP1の範囲を増やす変更は、実装前に本書も更新する。気づいた改善をすべて初期版へ入れず、航海の循環を改善するものから選ぶ。</w:t>
+      </w:r>
+    </w:p>
+    <w:p>
+      <w:pPr>
+        <w:pStyle w:val="Heading2"/>
+      </w:pPr>
+      <w:r>
+        <w:t>19 4 一航海の試作を先に完成させる工程</w:t>
+      </w:r>
+    </w:p>
+    <w:p>
+      <w:pPr/>
+      <w:r>
+        <w:t>2026年9月30日に、一航海の試作を先に完成させる開発順を採用した。M4aで観測一件を先行し、M4bで五港へ拡張した後、M5aで予報と十遭遇、M5bで第一章を完成させる。M4aの子作業は視認と寄り道、観測と報告、航路登録と帰路の順に進める。</w:t>
+      </w:r>
+    </w:p>
+    <w:tbl>
+      <w:tblPr>
+        <w:tblW w:type="auto" w:w="0"/>
+        <w:jc w:val="center"/>
+        <w:tblLayout w:type="fixed"/>
+        <w:tblLook w:firstColumn="1" w:firstRow="1" w:lastColumn="0" w:lastRow="0" w:noHBand="0" w:noVBand="1" w:val="04A0"/>
+        <w:tblBorders>
+          <w:top w:val="single" w:sz="4" w:color="D9D9D9"/>
+          <w:left w:val="single" w:sz="4" w:color="D9D9D9"/>
+          <w:bottom w:val="single" w:sz="4" w:color="D9D9D9"/>
+          <w:right w:val="single" w:sz="4" w:color="D9D9D9"/>
+          <w:insideH w:val="single" w:sz="4" w:color="D9D9D9"/>
+          <w:insideV w:val="single" w:sz="4" w:color="D9D9D9"/>
+        </w:tblBorders>
+      </w:tblPr>
+      <w:tblGrid>
+        <w:gridCol w:w="1872"/>
+        <w:gridCol w:w="3168"/>
+        <w:gridCol w:w="4752"/>
+      </w:tblGrid>
+      <w:tr>
+        <w:trPr>
+          <w:cantSplit/>
+          <w:tblHeader w:val="true"/>
+        </w:trPr>
+        <w:tc>
+          <w:tcPr>
+            <w:tcW w:type="dxa" w:w="1872"/>
+            <w:vAlign w:val="center"/>
+            <w:tcMar>
+              <w:top w:w="65" w:type="dxa"/>
+              <w:bottom w:w="65" w:type="dxa"/>
+              <w:left w:w="85" w:type="dxa"/>
+              <w:right w:w="85" w:type="dxa"/>
+            </w:tcMar>
+            <w:shd w:fill="DDEBF0"/>
+          </w:tcPr>
+          <w:p>
+            <w:pPr>
+              <w:keepNext w:val="0"/>
+              <w:keepLines w:val="0"/>
+              <w:spacing w:line="282" w:lineRule="exact" w:before="0" w:after="0"/>
+              <w:jc w:val="center"/>
+            </w:pPr>
+            <w:r>
+              <w:rPr>
+                <w:b/>
+                <w:color w:val="000000"/>
+                <w:sz w:val="20"/>
+              </w:rPr>
+            </w:r>
+            <w:r>
+              <w:rPr>
+                <w:b/>
+                <w:color w:val="000000"/>
+                <w:sz w:val="20"/>
+              </w:rPr>
+              <w:t>工程</w:t>
+            </w:r>
+          </w:p>
+        </w:tc>
+        <w:tc>
+          <w:tcPr>
+            <w:tcW w:type="dxa" w:w="3168"/>
+            <w:vAlign w:val="center"/>
+            <w:tcMar>
+              <w:top w:w="65" w:type="dxa"/>
+              <w:bottom w:w="65" w:type="dxa"/>
+              <w:left w:w="85" w:type="dxa"/>
+              <w:right w:w="85" w:type="dxa"/>
+            </w:tcMar>
+            <w:shd w:fill="DDEBF0"/>
+          </w:tcPr>
+          <w:p>
+            <w:pPr>
+              <w:keepNext w:val="0"/>
+              <w:keepLines w:val="0"/>
+              <w:spacing w:line="282" w:lineRule="exact" w:before="0" w:after="0"/>
+              <w:jc w:val="center"/>
+            </w:pPr>
+            <w:r>
+              <w:rPr>
+                <w:b/>
+                <w:color w:val="000000"/>
+                <w:sz w:val="20"/>
+              </w:rPr>
+            </w:r>
+            <w:r>
+              <w:rPr>
+                <w:b/>
+                <w:color w:val="000000"/>
+                <w:sz w:val="20"/>
+              </w:rPr>
+              <w:t>内容</w:t>
+            </w:r>
+          </w:p>
+        </w:tc>
+        <w:tc>
+          <w:tcPr>
+            <w:tcW w:type="dxa" w:w="4752"/>
+            <w:vAlign w:val="center"/>
+            <w:tcMar>
+              <w:top w:w="65" w:type="dxa"/>
+              <w:bottom w:w="65" w:type="dxa"/>
+              <w:left w:w="85" w:type="dxa"/>
+              <w:right w:w="85" w:type="dxa"/>
+            </w:tcMar>
+            <w:shd w:fill="DDEBF0"/>
+          </w:tcPr>
+          <w:p>
+            <w:pPr>
+              <w:keepNext w:val="0"/>
+              <w:keepLines w:val="0"/>
+              <w:spacing w:line="282" w:lineRule="exact" w:before="0" w:after="0"/>
+              <w:jc w:val="center"/>
+            </w:pPr>
+            <w:r>
+              <w:rPr>
+                <w:b/>
+                <w:color w:val="000000"/>
+                <w:sz w:val="20"/>
+              </w:rPr>
+            </w:r>
+            <w:r>
+              <w:rPr>
+                <w:b/>
+                <w:color w:val="000000"/>
+                <w:sz w:val="20"/>
+              </w:rPr>
+              <w:t>完了条件</w:t>
+            </w:r>
+          </w:p>
+        </w:tc>
+      </w:tr>
+      <w:tr>
+        <w:trPr>
+          <w:cantSplit/>
+        </w:trPr>
+        <w:tc>
+          <w:tcPr>
+            <w:tcW w:type="dxa" w:w="1872"/>
+            <w:vAlign w:val="center"/>
+            <w:tcMar>
+              <w:top w:w="65" w:type="dxa"/>
+              <w:bottom w:w="65" w:type="dxa"/>
+              <w:left w:w="85" w:type="dxa"/>
+              <w:right w:w="85" w:type="dxa"/>
+            </w:tcMar>
+            <w:shd w:fill="FFFFFF"/>
+          </w:tcPr>
+          <w:p>
+            <w:pPr>
+              <w:keepNext w:val="0"/>
+              <w:keepLines w:val="0"/>
+              <w:spacing w:line="282" w:lineRule="exact" w:before="0" w:after="0"/>
+              <w:jc w:val="left"/>
+            </w:pPr>
+            <w:r>
+              <w:rPr>
+                <w:b w:val="0"/>
+                <w:color w:val="000000"/>
+                <w:sz w:val="20"/>
+              </w:rPr>
+            </w:r>
+            <w:r>
+              <w:rPr>
+                <w:b w:val="0"/>
+                <w:color w:val="000000"/>
+                <w:sz w:val="20"/>
+              </w:rPr>
+              <w:t>M4a</w:t>
+            </w:r>
+          </w:p>
+        </w:tc>
+        <w:tc>
+          <w:tcPr>
+            <w:tcW w:type="dxa" w:w="3168"/>
+            <w:vAlign w:val="center"/>
+            <w:tcMar>
+              <w:top w:w="65" w:type="dxa"/>
+              <w:bottom w:w="65" w:type="dxa"/>
+              <w:left w:w="85" w:type="dxa"/>
+              <w:right w:w="85" w:type="dxa"/>
+            </w:tcMar>
+            <w:shd w:fill="FFFFFF"/>
+          </w:tcPr>
+          <w:p>
+            <w:pPr>
+              <w:keepNext w:val="0"/>
+              <w:keepLines w:val="0"/>
+              <w:spacing w:line="282" w:lineRule="exact" w:before="0" w:after="0"/>
+              <w:jc w:val="left"/>
+            </w:pPr>
+            <w:r>
+              <w:rPr>
+                <w:b w:val="0"/>
+                <w:color w:val="000000"/>
+                <w:sz w:val="20"/>
+              </w:rPr>
+            </w:r>
+            <w:r>
+              <w:rPr>
+                <w:b w:val="0"/>
+                <w:color w:val="000000"/>
+                <w:sz w:val="20"/>
+              </w:rPr>
+              <w:t>二港の一航海の試作</w:t>
+            </w:r>
+          </w:p>
+        </w:tc>
+        <w:tc>
+          <w:tcPr>
+            <w:tcW w:type="dxa" w:w="4752"/>
+            <w:vAlign w:val="center"/>
+            <w:tcMar>
+              <w:top w:w="65" w:type="dxa"/>
+              <w:bottom w:w="65" w:type="dxa"/>
+              <w:left w:w="85" w:type="dxa"/>
+              <w:right w:w="85" w:type="dxa"/>
+            </w:tcMar>
+            <w:shd w:fill="FFFFFF"/>
+          </w:tcPr>
+          <w:p>
+            <w:pPr>
+              <w:keepNext w:val="0"/>
+              <w:keepLines w:val="0"/>
+              <w:spacing w:line="282" w:lineRule="exact" w:before="0" w:after="0"/>
+              <w:jc w:val="left"/>
+            </w:pPr>
+            <w:r>
+              <w:rPr>
+                <w:b w:val="0"/>
+                <w:color w:val="000000"/>
+                <w:sz w:val="20"/>
+              </w:rPr>
+            </w:r>
+            <w:r>
+              <w:rPr>
+                <w:b w:val="0"/>
+                <w:color w:val="000000"/>
+                <w:sz w:val="20"/>
+              </w:rPr>
+              <w:t>発見と寄り道、観測と報告、登録と帰路がつながり、初見の三問を記録する</w:t>
+            </w:r>
+          </w:p>
+        </w:tc>
+      </w:tr>
+      <w:tr>
+        <w:trPr>
+          <w:cantSplit/>
+        </w:trPr>
+        <w:tc>
+          <w:tcPr>
+            <w:tcW w:type="dxa" w:w="1872"/>
+            <w:vAlign w:val="center"/>
+            <w:tcMar>
+              <w:top w:w="65" w:type="dxa"/>
+              <w:bottom w:w="65" w:type="dxa"/>
+              <w:left w:w="85" w:type="dxa"/>
+              <w:right w:w="85" w:type="dxa"/>
+            </w:tcMar>
+            <w:shd w:fill="FFFFFF"/>
+          </w:tcPr>
+          <w:p>
+            <w:pPr>
+              <w:keepNext w:val="0"/>
+              <w:keepLines w:val="0"/>
+              <w:spacing w:line="282" w:lineRule="exact" w:before="0" w:after="0"/>
+              <w:jc w:val="left"/>
+            </w:pPr>
+            <w:r>
+              <w:rPr>
+                <w:b w:val="0"/>
+                <w:color w:val="000000"/>
+                <w:sz w:val="20"/>
+              </w:rPr>
+            </w:r>
+            <w:r>
+              <w:rPr>
+                <w:b w:val="0"/>
+                <w:color w:val="000000"/>
+                <w:sz w:val="20"/>
+              </w:rPr>
+              <w:t>M4b</w:t>
+            </w:r>
+          </w:p>
+        </w:tc>
+        <w:tc>
+          <w:tcPr>
+            <w:tcW w:type="dxa" w:w="3168"/>
+            <w:vAlign w:val="center"/>
+            <w:tcMar>
+              <w:top w:w="65" w:type="dxa"/>
+              <w:bottom w:w="65" w:type="dxa"/>
+              <w:left w:w="85" w:type="dxa"/>
+              <w:right w:w="85" w:type="dxa"/>
+            </w:tcMar>
+            <w:shd w:fill="FFFFFF"/>
+          </w:tcPr>
+          <w:p>
+            <w:pPr>
+              <w:keepNext w:val="0"/>
+              <w:keepLines w:val="0"/>
+              <w:spacing w:line="282" w:lineRule="exact" w:before="0" w:after="0"/>
+              <w:jc w:val="left"/>
+            </w:pPr>
+            <w:r>
+              <w:rPr>
+                <w:b w:val="0"/>
+                <w:color w:val="000000"/>
+                <w:sz w:val="20"/>
+              </w:rPr>
+            </w:r>
+            <w:r>
+              <w:rPr>
+                <w:b w:val="0"/>
+                <w:color w:val="000000"/>
+                <w:sz w:val="20"/>
+              </w:rPr>
+              <w:t>五港と探索の拡張</w:t>
+            </w:r>
+          </w:p>
+        </w:tc>
+        <w:tc>
+          <w:tcPr>
+            <w:tcW w:type="dxa" w:w="4752"/>
+            <w:vAlign w:val="center"/>
+            <w:tcMar>
+              <w:top w:w="65" w:type="dxa"/>
+              <w:bottom w:w="65" w:type="dxa"/>
+              <w:left w:w="85" w:type="dxa"/>
+              <w:right w:w="85" w:type="dxa"/>
+            </w:tcMar>
+            <w:shd w:fill="FFFFFF"/>
+          </w:tcPr>
+          <w:p>
+            <w:pPr>
+              <w:keepNext w:val="0"/>
+              <w:keepLines w:val="0"/>
+              <w:spacing w:line="282" w:lineRule="exact" w:before="0" w:after="0"/>
+              <w:jc w:val="left"/>
+            </w:pPr>
+            <w:r>
+              <w:rPr>
+                <w:b w:val="0"/>
+                <w:color w:val="000000"/>
+                <w:sz w:val="20"/>
+              </w:rPr>
+            </w:r>
+            <w:r>
+              <w:rPr>
+                <w:b w:val="0"/>
+                <w:color w:val="000000"/>
+                <w:sz w:val="20"/>
+              </w:rPr>
+              <w:t>五港、五商品、噂、船の段階3から5を追加し、情報開示が一致する</w:t>
+            </w:r>
+          </w:p>
+        </w:tc>
+      </w:tr>
+      <w:tr>
+        <w:trPr>
+          <w:cantSplit/>
+        </w:trPr>
+        <w:tc>
+          <w:tcPr>
+            <w:tcW w:type="dxa" w:w="1872"/>
+            <w:vAlign w:val="center"/>
+            <w:tcMar>
+              <w:top w:w="65" w:type="dxa"/>
+              <w:bottom w:w="65" w:type="dxa"/>
+              <w:left w:w="85" w:type="dxa"/>
+              <w:right w:w="85" w:type="dxa"/>
+            </w:tcMar>
+            <w:shd w:fill="FFFFFF"/>
+          </w:tcPr>
+          <w:p>
+            <w:pPr>
+              <w:keepNext w:val="0"/>
+              <w:keepLines w:val="0"/>
+              <w:spacing w:line="282" w:lineRule="exact" w:before="0" w:after="0"/>
+              <w:jc w:val="left"/>
+            </w:pPr>
+            <w:r>
+              <w:rPr>
+                <w:b w:val="0"/>
+                <w:color w:val="000000"/>
+                <w:sz w:val="20"/>
+              </w:rPr>
+            </w:r>
+            <w:r>
+              <w:rPr>
+                <w:b w:val="0"/>
+                <w:color w:val="000000"/>
+                <w:sz w:val="20"/>
+              </w:rPr>
+              <w:t>M5a</w:t>
+            </w:r>
+          </w:p>
+        </w:tc>
+        <w:tc>
+          <w:tcPr>
+            <w:tcW w:type="dxa" w:w="3168"/>
+            <w:vAlign w:val="center"/>
+            <w:tcMar>
+              <w:top w:w="65" w:type="dxa"/>
+              <w:bottom w:w="65" w:type="dxa"/>
+              <w:left w:w="85" w:type="dxa"/>
+              <w:right w:w="85" w:type="dxa"/>
+            </w:tcMar>
+            <w:shd w:fill="FFFFFF"/>
+          </w:tcPr>
+          <w:p>
+            <w:pPr>
+              <w:keepNext w:val="0"/>
+              <w:keepLines w:val="0"/>
+              <w:spacing w:line="282" w:lineRule="exact" w:before="0" w:after="0"/>
+              <w:jc w:val="left"/>
+            </w:pPr>
+            <w:r>
+              <w:rPr>
+                <w:b w:val="0"/>
+                <w:color w:val="000000"/>
+                <w:sz w:val="20"/>
+              </w:rPr>
+            </w:r>
+            <w:r>
+              <w:rPr>
+                <w:b w:val="0"/>
+                <w:color w:val="000000"/>
+                <w:sz w:val="20"/>
+              </w:rPr>
+              <w:t>予報と十遭遇</w:t>
+            </w:r>
+          </w:p>
+        </w:tc>
+        <w:tc>
+          <w:tcPr>
+            <w:tcW w:type="dxa" w:w="4752"/>
+            <w:vAlign w:val="center"/>
+            <w:tcMar>
+              <w:top w:w="65" w:type="dxa"/>
+              <w:bottom w:w="65" w:type="dxa"/>
+              <w:left w:w="85" w:type="dxa"/>
+              <w:right w:w="85" w:type="dxa"/>
+            </w:tcMar>
+            <w:shd w:fill="FFFFFF"/>
+          </w:tcPr>
+          <w:p>
+            <w:pPr>
+              <w:keepNext w:val="0"/>
+              <w:keepLines w:val="0"/>
+              <w:spacing w:line="282" w:lineRule="exact" w:before="0" w:after="0"/>
+              <w:jc w:val="left"/>
+            </w:pPr>
+            <w:r>
+              <w:rPr>
+                <w:b w:val="0"/>
+                <w:color w:val="000000"/>
+                <w:sz w:val="20"/>
+              </w:rPr>
+            </w:r>
+            <w:r>
+              <w:rPr>
+                <w:b w:val="0"/>
+                <w:color w:val="000000"/>
+                <w:sz w:val="20"/>
+              </w:rPr>
+              <w:t>風と潮の影響、予報、危険と成果を確認し、選択中の停止と保存が成立する</w:t>
+            </w:r>
+          </w:p>
+        </w:tc>
+      </w:tr>
+      <w:tr>
+        <w:trPr>
+          <w:cantSplit/>
+        </w:trPr>
+        <w:tc>
+          <w:tcPr>
+            <w:tcW w:type="dxa" w:w="1872"/>
+            <w:vAlign w:val="center"/>
+            <w:tcMar>
+              <w:top w:w="65" w:type="dxa"/>
+              <w:bottom w:w="65" w:type="dxa"/>
+              <w:left w:w="85" w:type="dxa"/>
+              <w:right w:w="85" w:type="dxa"/>
+            </w:tcMar>
+            <w:shd w:fill="FFFFFF"/>
+          </w:tcPr>
+          <w:p>
+            <w:pPr>
+              <w:keepNext w:val="0"/>
+              <w:keepLines w:val="0"/>
+              <w:spacing w:line="282" w:lineRule="exact" w:before="0" w:after="0"/>
+              <w:jc w:val="left"/>
+            </w:pPr>
+            <w:r>
+              <w:rPr>
+                <w:b w:val="0"/>
+                <w:color w:val="000000"/>
+                <w:sz w:val="20"/>
+              </w:rPr>
+            </w:r>
+            <w:r>
+              <w:rPr>
+                <w:b w:val="0"/>
+                <w:color w:val="000000"/>
+                <w:sz w:val="20"/>
+              </w:rPr>
+              <w:t>M5b</w:t>
+            </w:r>
+          </w:p>
+        </w:tc>
+        <w:tc>
+          <w:tcPr>
+            <w:tcW w:type="dxa" w:w="3168"/>
+            <w:vAlign w:val="center"/>
+            <w:tcMar>
+              <w:top w:w="65" w:type="dxa"/>
+              <w:bottom w:w="65" w:type="dxa"/>
+              <w:left w:w="85" w:type="dxa"/>
+              <w:right w:w="85" w:type="dxa"/>
+            </w:tcMar>
+            <w:shd w:fill="FFFFFF"/>
+          </w:tcPr>
+          <w:p>
+            <w:pPr>
+              <w:keepNext w:val="0"/>
+              <w:keepLines w:val="0"/>
+              <w:spacing w:line="282" w:lineRule="exact" w:before="0" w:after="0"/>
+              <w:jc w:val="left"/>
+            </w:pPr>
+            <w:r>
+              <w:rPr>
+                <w:b w:val="0"/>
+                <w:color w:val="000000"/>
+                <w:sz w:val="20"/>
+              </w:rPr>
+            </w:r>
+            <w:r>
+              <w:rPr>
+                <w:b w:val="0"/>
+                <w:color w:val="000000"/>
+                <w:sz w:val="20"/>
+              </w:rPr>
+              <w:t>霧峰灯台の修復と帰還</w:t>
+            </w:r>
+          </w:p>
+        </w:tc>
+        <w:tc>
+          <w:tcPr>
+            <w:tcW w:type="dxa" w:w="4752"/>
+            <w:vAlign w:val="center"/>
+            <w:tcMar>
+              <w:top w:w="65" w:type="dxa"/>
+              <w:bottom w:w="65" w:type="dxa"/>
+              <w:left w:w="85" w:type="dxa"/>
+              <w:right w:w="85" w:type="dxa"/>
+            </w:tcMar>
+            <w:shd w:fill="FFFFFF"/>
+          </w:tcPr>
+          <w:p>
+            <w:pPr>
+              <w:keepNext w:val="0"/>
+              <w:keepLines w:val="0"/>
+              <w:spacing w:line="282" w:lineRule="exact" w:before="0" w:after="0"/>
+              <w:jc w:val="left"/>
+            </w:pPr>
+            <w:r>
+              <w:rPr>
+                <w:b w:val="0"/>
+                <w:color w:val="000000"/>
+                <w:sz w:val="20"/>
+              </w:rPr>
+            </w:r>
+            <w:r>
+              <w:rPr>
+                <w:b w:val="0"/>
+                <w:color w:val="000000"/>
+                <w:sz w:val="20"/>
+              </w:rPr>
+              <w:t>複数の方法で条件をそろえ、灯台を修復して改善した航路を使える</w:t>
+            </w:r>
+          </w:p>
+        </w:tc>
+      </w:tr>
+    </w:tbl>
+    <w:p>
+      <w:pPr/>
+      <w:r>
+        <w:t>M4はM4aとM4bの両方、M5はM5aとM5bの両方を確認して閉じる。M4aで三問の結果を記録し、発見に気付けない、判断の理由が伝わらない、帰港後の目的が残らない場合は、配置、会話、見積り、航海帳を修正して再確認する。詳細は docs/voyage-prototype-plan.md、試遊の記録は docs/voyage-prototype-playtest.md を参照する。</w:t>
+      </w:r>
+    </w:p>
+    <w:p>
+      <w:pPr>
+        <w:pStyle w:val="Heading2"/>
+      </w:pPr>
+      <w:r>
+        <w:t>19 5 作業と確認結果をGitHubに記録する</w:t>
+      </w:r>
+    </w:p>
+    <w:p>
+      <w:pPr/>
+      <w:r>
+        <w:t>各工程はGitHubのIssueへ作業内容、依存関係、完了条件を記録し、実装コミットと確認結果を結び付ける。現在の実装範囲は docs/development-status.md、採用した判断と変更理由は docs/development-log.md へ残す。処理テスト、画面確認、保存の確認、利用者による初見の試遊を区別し、未実施を成功として記録しない。子作業が閉じても、一航海の通し確認と初見の三問が未実施ならM4aを完了扱いにしない。</w:t>
       </w:r>
     </w:p>
     <w:p>
@@ -18045,7 +18701,7 @@
     </w:p>
     <w:p>
       <w:r>
-        <w:t>試遊後に聞く内容は、「次に行きたかった場所」「帰還する理由が分かったか」「困ったときに選べる行動があったか」「同じ操作が続きすぎた箇所」とする。達成率と時間は少人数の試遊でも記録し、印象だけで難度を変えない。初期版にはアクセス解析を必須とせず、同意を得た試遊記録で改善する。</w:t>
+        <w:t>M4aの試遊後は、「何を見つけたか」「なぜ進路を変えたか」「帰港後に次は何をしたいか」を確認する。進路を変えなかった場合は、直行や後回しを選んだ理由を記録する。P1以降は、帰還の理由、困ったときに選べる行動、同じ操作が続きすぎた箇所も確認する。達成率と時間は少人数の試遊でも記録し、印象だけで難度を変えない。初期版にはアクセス解析を必須とせず、同意を得た試遊記録で改善する。</w:t>
       </w:r>
     </w:p>
     <w:p>
@@ -18098,7 +18754,7 @@
     </w:p>
     <w:p>
       <w:r>
-        <w:t>着手する範囲はM0〜M3の二港試作とする。「木材を運び、利益を出し、補給し、船を改造し、保存して再開する」という一続きの体験を最初の確認対象にする。それが成立したらM4とM5を追加し、灯台の修理で終わる第一章を公開できるゲームにする。</w:t>
+        <w:t>M0〜M3の二港試作と初回ガイドはv0.1.1で完了した。次に着手するのはM4aの一航海の試作とする。浮標の発見、寄り道、観測、報告、航路登録、帰路をつなぎ、初見の三問を記録して必要な修正を終えてからM4b、M5a、M5bへ進む。M5bで灯台修理と帰還を実装し、第一章を公開できるゲームにする。</w:t>
       </w:r>
     </w:p>
     <w:p>

</xml_diff>